<commit_message>
fix(bolema): corrige fonte/formatação dos resumos e confirma espaçamento
2º desk-reject apontou: "rever fonte e formatação dos resumos; rever o
espaçamento e adequar ao template".

- Resumo/Abstract: forçado TNR 10 (o estilo 'local' do template é Arial 14
  por baixo; só a fonte fora trocada, não o tamanho → saíam em TNR 14).
- Cabeçalhos "Resumo"/"Abstract" centralizados; palavras-chave/keywords
  justificadas — conforme o bloco de resumo do template.
- Corpo confirmado em 1,5 (Δbaseline 20,7pt medido no Word/PDF real),
  igual ao template. 18 páginas.

Co-Authored-By: Claude Opus 4.8 <noreply@anthropic.com>
</commit_message>
<xml_diff>
--- a/articles/calculo-bolema-TEMPLATE.docx
+++ b/articles/calculo-bolema-TEMPLATE.docx
@@ -36,6 +36,7 @@
       <w:pPr>
         <w:spacing w:before="120" w:after="0"/>
         <w:ind w:firstLine="0"/>
+        <w:jc w:val="center"/>
       </w:pPr>
       <w:r>
         <w:rPr>
@@ -54,6 +55,7 @@
       <w:r>
         <w:rPr>
           <w:rFonts w:ascii="Times New Roman" w:hAnsi="Times New Roman" w:cs="Times New Roman" w:eastAsia="Times New Roman"/>
+          <w:sz w:val="20"/>
         </w:rPr>
         <w:t>Este artigo conduz uma revisão documental comparada dos currículos oficiais de matemática do ensino médio, com foco específico na presença ou ausência de cálculo diferencial e integral antes do ingresso no ensino superior. Foram analisados documentos curriculares e de avaliação de sistemas educacionais nacionais em cinco continentes, abrangendo países de alta, média e baixa renda, além do programa International Baccalaureate. O achado central é que o Brasil é o único país da amostra cujo currículo nacional do ensino médio não contempla limites, derivadas ou integrais. Discutem-se o marco pedagógico que fundamenta a viabilidade da reintrodução — ilustrado por uma sequência didática à luz de Bruner —, a trajetória de duzentos anos do currículo brasileiro, do Colégio Pedro II à BNCC, e indicadores contextuais associados, como o desempenho em avaliações internacionais e as elevadas taxas de reprovação em Cálculo I nas engenharias. O achado central é verificável de forma automatizada sobre os documentos curriculares oficiais. Conclui-se que o vácuo é estrutural, historicamente documentado e pedagogicamente solucionável, ainda que a inferência causal estrita entre a ausência curricular e os indicadores observados permaneça limitada.</w:t>
       </w:r>
@@ -63,6 +65,7 @@
         <w:pStyle w:val="local"/>
         <w:spacing w:before="120" w:after="120"/>
         <w:ind w:firstLine="0"/>
+        <w:jc w:val="both"/>
       </w:pPr>
       <w:r>
         <w:rPr>
@@ -77,6 +80,7 @@
       <w:pPr>
         <w:spacing w:before="120" w:after="0"/>
         <w:ind w:firstLine="0"/>
+        <w:jc w:val="center"/>
       </w:pPr>
       <w:r>
         <w:rPr>
@@ -95,6 +99,7 @@
       <w:r>
         <w:rPr>
           <w:rFonts w:ascii="Times New Roman" w:hAnsi="Times New Roman" w:cs="Times New Roman" w:eastAsia="Times New Roman"/>
+          <w:sz w:val="20"/>
         </w:rPr>
         <w:t>This article presents a comparative documentary review of official upper-secondary mathematics curricula, focusing specifically on the presence or absence of differential and integral calculus before entry into higher education. Curriculum and assessment documents from national education systems across five continents were analysed, including high-, middle- and low-income countries, as well as the International Baccalaureate programme. The central finding is that Brazil is the only country in the sample whose national upper-secondary curriculum does not include limits, derivatives or integrals. We discuss the pedagogical framework supporting the feasibility of reintroduction — illustrated by a Bruner-inspired teaching sequence —, the two-hundred-year trajectory of the Brazilian curriculum, from Colégio Pedro II to the BNCC, and associated contextual indicators, such as performance in international assessments and high failure rates in university Calculus I in engineering programmes. The central finding is verifiable automatically against the official curricular documents. We conclude that the gap is structural, historically documented and pedagogically solvable, although strict causal inference between the curricular absence and the observed indicators remains limited.</w:t>
       </w:r>
@@ -104,6 +109,7 @@
         <w:pStyle w:val="local"/>
         <w:spacing w:before="120" w:after="240"/>
         <w:ind w:firstLine="0"/>
+        <w:jc w:val="both"/>
       </w:pPr>
       <w:r>
         <w:rPr>

</xml_diff>